<commit_message>
Repair Word drawing scalar whitespace
</commit_message>
<xml_diff>
--- a/tests/fixtures/word-regenerate-invalid/regenerated/unknown/unknown/text-box.orphan-part.docx
+++ b/tests/fixtures/word-regenerate-invalid/regenerated/unknown/unknown/text-box.orphan-part.docx
@@ -14,12 +14,10 @@
               <wp:anchor distT="0" distB="0" distL="114300" distR="114300" simplePos="0" relativeHeight="251659264" behindDoc="0" locked="0" layoutInCell="1" allowOverlap="1" wp14:editId="36B11C9B">
                 <wp:simplePos x="0" y="0"/>
                 <wp:positionH relativeFrom="column">
-                  <wp:align>center
-                  </wp:align>
+                  <wp:align>center</wp:align>
                 </wp:positionH>
                 <wp:positionV relativeFrom="paragraph">
-                  <wp:posOffset>0
-                  </wp:posOffset>
+                  <wp:posOffset>0</wp:posOffset>
                 </wp:positionV>
                 <wp:extent cx="2374265" cy="1403985"/>
                 <wp:effectExtent l="0" t="0" r="3175" b="5715"/>
@@ -73,12 +71,10 @@
                   </a:graphicData>
                 </a:graphic>
                 <wp14:sizeRelH relativeFrom="margin">
-                  <wp14:pctWidth>40000
-                  </wp14:pctWidth>
+                  <wp14:pctWidth>40000</wp14:pctWidth>
                 </wp14:sizeRelH>
                 <wp14:sizeRelV relativeFrom="margin">
-                  <wp14:pctHeight>20000
-                  </wp14:pctHeight>
+                  <wp14:pctHeight>20000</wp14:pctHeight>
                 </wp14:sizeRelV>
               </wp:anchor>
             </w:drawing>

</xml_diff>